<commit_message>
feat: scope workspace access by project membership
</commit_message>
<xml_diff>
--- a/Group61_Assignment02_CollabBoard_Report.docx
+++ b/Group61_Assignment02_CollabBoard_Report.docx
@@ -207,7 +207,7 @@
                 <w:color w:val="0B2545"/>
                 <w:sz w:val="22"/>
               </w:rPr>
-              <w:t>The React application now performs authentication, project CRUD, task CRUD and status movement, Team reads, and Settings updates through protected REST endpoints without direct page-level fetch calls or automatic mock fallback.</w:t>
+              <w:t>The React application now performs authentication, membership-scoped project and task workflows, collaboration-aware Team reads, and Settings updates through protected REST endpoints without direct page-level fetch calls or automatic mock fallback.</w:t>
             </w:r>
           </w:p>
         </w:tc>
@@ -1328,7 +1328,7 @@
           <w:rFonts w:ascii="Calibri" w:hAnsi="Calibri"/>
           <w:sz w:val="22"/>
         </w:rPr>
-        <w:t>Correct HTTP semantics are used: 400 invalid input, 401 missing or invalid JWT, 403 forbidden profile update, 404 missing entity or route, 409 identity or relationship conflict, and 500 unexpected server errors.</w:t>
+        <w:t>Correct HTTP semantics are used: 400 invalid input or immutable-field change, 401 missing or invalid JWT, 403 visible owner-only operation, non-disclosing 404 for inaccessible entities, 409 identity or member-assignment conflict, and 500 unexpected server errors.</w:t>
       </w:r>
     </w:p>
     <w:p>
@@ -1434,7 +1434,7 @@
           <w:rFonts w:ascii="Calibri" w:hAnsi="Calibri"/>
           <w:sz w:val="22"/>
         </w:rPr>
-        <w:t>Task creatorId is always derived from the JWT. Client-provided creator IDs are ignored. Profile updates are self-only; project and task CRUD is shared among authenticated workspace members without adding advanced RBAC to this milestone.</w:t>
+        <w:t>Task creatorId and project ownerId are derived from the JWT. Profile updates are self-only. Projects are visible only to their owner and members; project management is owner-only, while project members may perform task CRUD inside accessible projects. Task projectId is immutable after creation.</w:t>
       </w:r>
     </w:p>
     <w:p>
@@ -1927,7 +1927,7 @@
           <w:rFonts w:ascii="Calibri" w:hAnsi="Calibri"/>
           <w:sz w:val="22"/>
         </w:rPr>
-        <w:t>Task queries accept projectId, assigneeId, status, priority, and label. Progress, workload, overdue totals, Dashboard counts, and project contribution remain frontend selector responsibilities.</w:t>
+        <w:t>Task queries first restrict results to accessible non-archived projects and then accept projectId, assigneeId, status, priority, and label. Progress, workload, overdue totals, Dashboard counts, and project contribution remain frontend selector responsibilities. GET /api/users remains the registered account directory; the Team UI separately derives only shared-project collaborators.</w:t>
       </w:r>
     </w:p>
     <w:p>
@@ -2136,7 +2136,7 @@
           <w:rFonts w:ascii="Calibri" w:hAnsi="Calibri"/>
           <w:sz w:val="22"/>
         </w:rPr>
-        <w:t>The Postman v2.1 collection is stored at postman/CollabBoard_Assignment02.postman_collection.json. It defines baseUrl, token, userId, projectId, and taskId variables. Login captures the JWT; create operations capture temporary IDs; cleanup requests delete the temporary task and project.</w:t>
+        <w:t>The Postman v2.1 collection is stored at postman/CollabBoard_Assignment02.postman_collection.json. It defines baseUrl, ownerToken, userBToken, and deterministic entity variables. Its access-scoping sequence registers an unassigned user, verifies empty visibility, grants and revokes membership, checks non-disclosing 404 responses, validates member-removal conflicts, and restores seeded state.</w:t>
       </w:r>
     </w:p>
     <w:p>
@@ -2148,7 +2148,7 @@
         <w:drawing>
           <wp:inline xmlns:a="http://schemas.openxmlformats.org/drawingml/2006/main" xmlns:pic="http://schemas.openxmlformats.org/drawingml/2006/picture">
             <wp:extent cx="5760720" cy="3840480"/>
-            <wp:docPr id="2" name="Picture 2" descr="Figure 2. Executable collection result: 17 requests, 17 assertions, 0 failures." title="Figure 2"/>
+            <wp:docPr id="2" name="Picture 2" descr="Figure 2. Executable access-scoping collection result: 28 requests, 28 assertions, 0 failures." title="Figure 2"/>
             <wp:cNvGraphicFramePr>
               <a:graphicFrameLocks noChangeAspect="1"/>
             </wp:cNvGraphicFramePr>
@@ -2185,7 +2185,7 @@
         <w:jc w:val="center"/>
       </w:pPr>
       <w:r>
-        <w:t>Figure 2. Executable collection result: 17 requests, 17 assertions, 0 failures.</w:t>
+        <w:t>Figure 2. Executable access-scoping collection result: 28 requests, 28 assertions, 0 failures.</w:t>
       </w:r>
     </w:p>
     <w:p>
@@ -2209,7 +2209,7 @@
       <w:r>
         <w:drawing>
           <wp:inline xmlns:a="http://schemas.openxmlformats.org/drawingml/2006/main" xmlns:pic="http://schemas.openxmlformats.org/drawingml/2006/picture">
-            <wp:extent cx="5760720" cy="3601966"/>
+            <wp:extent cx="5760720" cy="4099207"/>
             <wp:docPr id="3" name="Picture 3" descr="Figure 3. API-backed Dashboard with derived task counts and deadlines." title="Figure 3"/>
             <wp:cNvGraphicFramePr>
               <a:graphicFrameLocks noChangeAspect="1"/>
@@ -2230,7 +2230,7 @@
                   <pic:spPr>
                     <a:xfrm>
                       <a:off x="0" y="0"/>
-                      <a:ext cx="5760720" cy="3601966"/>
+                      <a:ext cx="5760720" cy="4099207"/>
                     </a:xfrm>
                     <a:prstGeom prst="rect"/>
                   </pic:spPr>
@@ -2263,7 +2263,7 @@
       <w:r>
         <w:drawing>
           <wp:inline xmlns:a="http://schemas.openxmlformats.org/drawingml/2006/main" xmlns:pic="http://schemas.openxmlformats.org/drawingml/2006/picture">
-            <wp:extent cx="5760720" cy="3600450"/>
+            <wp:extent cx="5760720" cy="4000500"/>
             <wp:docPr id="4" name="Picture 4" descr="Figure 4. Canonical project list loaded from the REST API." title="Figure 4"/>
             <wp:cNvGraphicFramePr>
               <a:graphicFrameLocks noChangeAspect="1"/>
@@ -2284,7 +2284,7 @@
                   <pic:spPr>
                     <a:xfrm>
                       <a:off x="0" y="0"/>
-                      <a:ext cx="5760720" cy="3600450"/>
+                      <a:ext cx="5760720" cy="4000500"/>
                     </a:xfrm>
                     <a:prstGeom prst="rect"/>
                   </pic:spPr>
@@ -2312,7 +2312,7 @@
       <w:r>
         <w:drawing>
           <wp:inline xmlns:a="http://schemas.openxmlformats.org/drawingml/2006/main" xmlns:pic="http://schemas.openxmlformats.org/drawingml/2006/picture">
-            <wp:extent cx="5760720" cy="3601966"/>
+            <wp:extent cx="5760720" cy="4818792"/>
             <wp:docPr id="5" name="Picture 5" descr="Figure 5. Project-specific Website Development Kanban board." title="Figure 5"/>
             <wp:cNvGraphicFramePr>
               <a:graphicFrameLocks noChangeAspect="1"/>
@@ -2333,7 +2333,7 @@
                   <pic:spPr>
                     <a:xfrm>
                       <a:off x="0" y="0"/>
-                      <a:ext cx="5760720" cy="3601966"/>
+                      <a:ext cx="5760720" cy="4818792"/>
                     </a:xfrm>
                     <a:prstGeom prst="rect"/>
                   </pic:spPr>
@@ -2366,8 +2366,8 @@
       <w:r>
         <w:drawing>
           <wp:inline xmlns:a="http://schemas.openxmlformats.org/drawingml/2006/main" xmlns:pic="http://schemas.openxmlformats.org/drawingml/2006/picture">
-            <wp:extent cx="5760720" cy="5064181"/>
-            <wp:docPr id="6" name="Picture 6" descr="Figure 6. Five-member Team workload and completion metrics at 1024 px." title="Figure 6"/>
+            <wp:extent cx="5760720" cy="3240405"/>
+            <wp:docPr id="6" name="Picture 6" descr="Figure 6. Shared-project Team collaborators and project-scoped metrics." title="Figure 6"/>
             <wp:cNvGraphicFramePr>
               <a:graphicFrameLocks noChangeAspect="1"/>
             </wp:cNvGraphicFramePr>
@@ -2375,7 +2375,7 @@
               <a:graphicData uri="http://schemas.openxmlformats.org/drawingml/2006/picture">
                 <pic:pic>
                   <pic:nvPicPr>
-                    <pic:cNvPr id="0" name="team-1024.png"/>
+                    <pic:cNvPr id="0" name="team-1440.png"/>
                     <pic:cNvPicPr/>
                   </pic:nvPicPr>
                   <pic:blipFill>
@@ -2387,7 +2387,7 @@
                   <pic:spPr>
                     <a:xfrm>
                       <a:off x="0" y="0"/>
-                      <a:ext cx="5760720" cy="5064181"/>
+                      <a:ext cx="5760720" cy="3240405"/>
                     </a:xfrm>
                     <a:prstGeom prst="rect"/>
                   </pic:spPr>
@@ -2404,7 +2404,7 @@
         <w:jc w:val="center"/>
       </w:pPr>
       <w:r>
-        <w:t>Figure 6. Five-member Team workload and completion metrics at 1024 px.</w:t>
+        <w:t>Figure 6. Shared-project Team collaborators and project-scoped metrics.</w:t>
       </w:r>
     </w:p>
     <w:p>
@@ -2749,7 +2749,7 @@
                 <w:rFonts w:ascii="Calibri" w:hAnsi="Calibri"/>
                 <w:sz w:val="19"/>
               </w:rPr>
-              <w:t>7 files, 12 tests</w:t>
+              <w:t>9 files, 20 tests</w:t>
             </w:r>
           </w:p>
         </w:tc>
@@ -2823,7 +2823,7 @@
                 <w:rFonts w:ascii="Calibri" w:hAnsi="Calibri"/>
                 <w:sz w:val="19"/>
               </w:rPr>
-              <w:t>1 file, 7 scenarios</w:t>
+              <w:t>1 file, 14 tests</w:t>
             </w:r>
           </w:p>
         </w:tc>
@@ -2897,7 +2897,7 @@
                 <w:rFonts w:ascii="Calibri" w:hAnsi="Calibri"/>
                 <w:sz w:val="19"/>
               </w:rPr>
-              <w:t>17 requests, 17 assertions, 0 failures</w:t>
+              <w:t>28 requests, 28 assertions, 0 failures</w:t>
             </w:r>
           </w:p>
         </w:tc>
@@ -2971,7 +2971,7 @@
                 <w:rFonts w:ascii="Calibri" w:hAnsi="Calibri"/>
                 <w:sz w:val="19"/>
               </w:rPr>
-              <w:t>Vite transformed 102 modules</w:t>
+              <w:t>Vite transformed 104 modules</w:t>
             </w:r>
           </w:p>
         </w:tc>
@@ -3119,7 +3119,7 @@
                 <w:rFonts w:ascii="Calibri" w:hAnsi="Calibri"/>
                 <w:sz w:val="19"/>
               </w:rPr>
-              <w:t>Handled 409 produced zero new console errors</w:t>
+              <w:t>Offline, Retry, 401, and 409 flows had no unhandled rejection</w:t>
             </w:r>
           </w:p>
         </w:tc>
@@ -3136,7 +3136,7 @@
           <w:rFonts w:ascii="Calibri" w:hAnsi="Calibri"/>
           <w:sz w:val="22"/>
         </w:rPr>
-        <w:t>Live browser QA used the real API mode. It verified login and JWT restoration, invalid-token clearing, project creation, task creation/edit/status movement, project isolation, Team and Member Details, Settings synchronization, relationship conflict feedback, direct route refreshes, and mobile sidebar geometry.</w:t>
+        <w:t>Live browser QA used real API mode. It verified startup, login and JWT restoration, offline error handling and Retry, invalid-token clearing, zero-project empty states, project-scoped Sidebar data, Team union and project filters, assignment project choice, owner-only controls, direct route refreshes, and responsive layouts.</w:t>
       </w:r>
     </w:p>
     <w:p>
@@ -3145,7 +3145,7 @@
           <w:rFonts w:ascii="Calibri" w:hAnsi="Calibri"/>
           <w:sz w:val="22"/>
         </w:rPr>
-        <w:t>Backend tests additionally verified destructive task/project cleanup, project delete cascade, invalid assignees, self-only user updates, protected routes, and normalized 400/401/403/404/409 errors.</w:t>
+        <w:t>Backend tests additionally verified user-scoped project and task lists, archive semantics, access grant and revocation, the member-removal 409 sequence, non-disclosing entity reads, member task CRUD, invalid assignees, immutable projectId, self-only user updates, and normalized 400/401/403/404/409 errors.</w:t>
       </w:r>
     </w:p>
     <w:p>
@@ -3218,6 +3218,18 @@
     </w:p>
     <w:p>
       <w:pPr>
+        <w:pStyle w:val="ListBullet"/>
+      </w:pPr>
+      <w:r>
+        <w:rPr>
+          <w:rFonts w:ascii="Calibri" w:hAnsi="Calibri"/>
+          <w:sz w:val="22"/>
+        </w:rPr>
+        <w:t>Archived projects remain directly readable to members but have no archive-center UI in this campaign.</w:t>
+      </w:r>
+    </w:p>
+    <w:p>
+      <w:pPr>
         <w:pStyle w:val="Heading1"/>
       </w:pPr>
       <w:r>
@@ -3230,7 +3242,7 @@
           <w:rFonts w:ascii="Calibri" w:hAnsi="Calibri"/>
           <w:sz w:val="22"/>
         </w:rPr>
-        <w:t>CollabBoard now satisfies the technical Assignment 02 objective: a completed React frontend communicates through stable asynchronous service contracts with a JWT-protected Express REST API using deterministic in-memory backend data. Core project, task, team, authentication, and settings workflows operate through HTTP while derived presentation metrics remain correctly owned by frontend selectors.</w:t>
+        <w:t>CollabBoard now satisfies the technical Assignment 02 objective: a completed React frontend communicates through stable asynchronous service contracts with a JWT-protected Express REST API using deterministic in-memory backend data. Project and task visibility is enforced by ownership and membership on the server, while Team collaboration is derived only from shared active projects and presentation metrics remain frontend-owned.</w:t>
       </w:r>
     </w:p>
     <w:p>

</xml_diff>